<commit_message>
Pin terms/beta-1 and set effective date
Mark terms/beta-1 as final and update related code, docs and tests. Added the effective date "18 September 2026" and the pinned SHA for terms/beta-1; updated the Markdown and .docx source (contact email and address filled). Adjusted templates and the /legal/current rendering to return the recorded effective date. Expanded tests to assert the term is pinned, not a draft, and that placeholders are gone. Minor comment/route wording updates. Also: re-measured restore counts changed to 238 in SQL/generator and docs; cutover_checks gained --old-uri support and query routing for old/new schema comparisons.
</commit_message>
<xml_diff>
--- a/legal/terms/Minty Terms of Use Beta (2 Jul 2026).docx
+++ b/legal/terms/Minty Terms of Use Beta (2 Jul 2026).docx
@@ -63,7 +63,7 @@
           <w:szCs w:val="21"/>
           <w:lang w:val="en-GB"/>
         </w:rPr>
-        <w:t xml:space="preserve"> [DATE]</w:t>
+        <w:t xml:space="preserve"> 18 September 2026</w:t>
       </w:r>
     </w:p>
     <w:p xmlns:wp14="http://schemas.microsoft.com/office/word/2010/wordml" wp14:paraId="2D5EA6A3" wp14:textId="40F93D99">
@@ -6035,7 +6035,7 @@
           <w:szCs w:val="21"/>
           <w:lang w:val="en-GB"/>
         </w:rPr>
-        <w:t>Email: [INSERT EMAIL]</w:t>
+        <w:t>Email: hello@dailyminty.com</w:t>
       </w:r>
     </w:p>
     <w:p xmlns:wp14="http://schemas.microsoft.com/office/word/2010/wordml" wp14:paraId="71EF83D1" wp14:textId="08802429">
@@ -6054,7 +6054,7 @@
           <w:szCs w:val="21"/>
           <w:lang w:val="en-GB"/>
         </w:rPr>
-        <w:t>Address: [INSERT ADDRESS]</w:t>
+        <w:t>Address: Level 5, K11 Atelier, 728 King's Road, Quarry Bay, HONG KONG</w:t>
       </w:r>
     </w:p>
     <w:p xmlns:wp14="http://schemas.microsoft.com/office/word/2010/wordml" wp14:paraId="5E5787A5" wp14:textId="628C321E"/>

</xml_diff>